<commit_message>
docs(outputs): drop class and semester placeholders from the BTL package
- Report: remove the "Lớp tín chỉ · Học kỳ" cover line and the Lớp column of
  the assignment table; PDF regenerated, still 108 pages with unchanged TOC.
- Workbook: remove ThongTin row class_semester.
- Per-member Word files regenerated from the updated report.
- README, KIEM_TRA_HOAN_THIEN and checksums.json updated.

Co-Authored-By: Claude Opus 5.5 <noreply@anthropic.com>
</commit_message>
<xml_diff>
--- a/outputs/Nhom13_PhanViec_ca_nhan/Nhom13_23010345_DangNhatNhat_PhanViec.docx
+++ b/outputs/Nhom13_PhanViec_ca_nhan/Nhom13_23010345_DangNhatNhat_PhanViec.docx
@@ -384,61 +384,6 @@
           <w:szCs w:val="32"/>
         </w:rPr>
         <w:t>Học phần: CSE703093 – An toàn phần mềm</w:t>
-      </w:r>
-    </w:p>
-    <w:p>
-      <w:pPr>
-        <w:pStyle w:val="NoSpacing"/>
-        <w:jc w:val="center"/>
-        <w:rPr>
-          <w:rStyle w:val="fontstyle21"/>
-          <w:rFonts w:ascii="Times New Roman" w:hAnsi="Times New Roman" w:cs="Times New Roman"/>
-          <w:color w:val="808080"/>
-          <w:sz w:val="32"/>
-          <w:szCs w:val="32"/>
-        </w:rPr>
-      </w:pPr>
-      <w:r>
-        <w:rPr>
-          <w:rStyle w:val="fontstyle21"/>
-          <w:rFonts w:ascii="Times New Roman" w:hAnsi="Times New Roman" w:cs="Times New Roman"/>
-          <w:color w:val="000000"/>
-          <w:sz w:val="32"/>
-          <w:szCs w:val="32"/>
-        </w:rPr>
-        <w:t xml:space="preserve">Lớp tín chỉ: </w:t>
-      </w:r>
-      <w:r>
-        <w:rPr>
-          <w:rStyle w:val="fontstyle21"/>
-          <w:rFonts w:ascii="Times New Roman" w:hAnsi="Times New Roman" w:cs="Times New Roman"/>
-          <w:color w:val="000000"/>
-          <w:sz w:val="32"/>
-          <w:szCs w:val="32"/>
-          <w:highlight w:val="yellow"/>
-        </w:rPr>
-        <w:t>[Điền vào]</w:t>
-      </w:r>
-      <w:r>
-        <w:rPr>
-          <w:rStyle w:val="fontstyle21"/>
-          <w:rFonts w:ascii="Times New Roman" w:hAnsi="Times New Roman" w:cs="Times New Roman"/>
-          <w:color w:val="000000"/>
-          <w:sz w:val="32"/>
-          <w:szCs w:val="32"/>
-        </w:rPr>
-        <w:t xml:space="preserve">  ·  Học kỳ: </w:t>
-      </w:r>
-      <w:r>
-        <w:rPr>
-          <w:rStyle w:val="fontstyle21"/>
-          <w:rFonts w:ascii="Times New Roman" w:hAnsi="Times New Roman" w:cs="Times New Roman"/>
-          <w:color w:val="000000"/>
-          <w:sz w:val="32"/>
-          <w:szCs w:val="32"/>
-          <w:highlight w:val="yellow"/>
-        </w:rPr>
-        <w:t>[Điền vào]</w:t>
       </w:r>
     </w:p>
     <w:p>
@@ -713,7 +658,7 @@
           <w:r>
             <w:fldChar w:fldCharType="separate"/>
           </w:r>
-          <w:hyperlink w:anchor="_Toc243599170" w:history="1">
+          <w:hyperlink w:anchor="_Toc243599876" w:history="1">
             <w:r>
               <w:rPr>
                 <w:rStyle w:val="Hyperlink"/>
@@ -740,7 +685,7 @@
                 <w:noProof/>
                 <w:webHidden/>
               </w:rPr>
-              <w:instrText xml:space="preserve"> PAGEREF _Toc243599170 \h </w:instrText>
+              <w:instrText xml:space="preserve"> PAGEREF _Toc243599876 \h </w:instrText>
             </w:r>
             <w:r>
               <w:rPr>
@@ -787,7 +732,7 @@
               <w14:ligatures w14:val="standardContextual"/>
             </w:rPr>
           </w:pPr>
-          <w:hyperlink w:anchor="_Toc243599171" w:history="1">
+          <w:hyperlink w:anchor="_Toc243599877" w:history="1">
             <w:r>
               <w:rPr>
                 <w:rStyle w:val="Hyperlink"/>
@@ -815,7 +760,7 @@
                 <w:noProof/>
                 <w:webHidden/>
               </w:rPr>
-              <w:instrText xml:space="preserve"> PAGEREF _Toc243599171 \h </w:instrText>
+              <w:instrText xml:space="preserve"> PAGEREF _Toc243599877 \h </w:instrText>
             </w:r>
             <w:r>
               <w:rPr>
@@ -861,7 +806,7 @@
               <w14:ligatures w14:val="standardContextual"/>
             </w:rPr>
           </w:pPr>
-          <w:hyperlink w:anchor="_Toc243599172" w:history="1">
+          <w:hyperlink w:anchor="_Toc243599878" w:history="1">
             <w:r>
               <w:rPr>
                 <w:rStyle w:val="Hyperlink"/>
@@ -889,7 +834,7 @@
                 <w:noProof/>
                 <w:webHidden/>
               </w:rPr>
-              <w:instrText xml:space="preserve"> PAGEREF _Toc243599172 \h </w:instrText>
+              <w:instrText xml:space="preserve"> PAGEREF _Toc243599878 \h </w:instrText>
             </w:r>
             <w:r>
               <w:rPr>
@@ -935,7 +880,7 @@
               <w14:ligatures w14:val="standardContextual"/>
             </w:rPr>
           </w:pPr>
-          <w:hyperlink w:anchor="_Toc243599173" w:history="1">
+          <w:hyperlink w:anchor="_Toc243599879" w:history="1">
             <w:r>
               <w:rPr>
                 <w:rStyle w:val="Hyperlink"/>
@@ -963,7 +908,7 @@
                 <w:noProof/>
                 <w:webHidden/>
               </w:rPr>
-              <w:instrText xml:space="preserve"> PAGEREF _Toc243599173 \h </w:instrText>
+              <w:instrText xml:space="preserve"> PAGEREF _Toc243599879 \h </w:instrText>
             </w:r>
             <w:r>
               <w:rPr>
@@ -1009,7 +954,7 @@
               <w14:ligatures w14:val="standardContextual"/>
             </w:rPr>
           </w:pPr>
-          <w:hyperlink w:anchor="_Toc243599174" w:history="1">
+          <w:hyperlink w:anchor="_Toc243599880" w:history="1">
             <w:r>
               <w:rPr>
                 <w:rStyle w:val="Hyperlink"/>
@@ -1037,7 +982,7 @@
                 <w:noProof/>
                 <w:webHidden/>
               </w:rPr>
-              <w:instrText xml:space="preserve"> PAGEREF _Toc243599174 \h </w:instrText>
+              <w:instrText xml:space="preserve"> PAGEREF _Toc243599880 \h </w:instrText>
             </w:r>
             <w:r>
               <w:rPr>
@@ -1083,7 +1028,7 @@
               <w14:ligatures w14:val="standardContextual"/>
             </w:rPr>
           </w:pPr>
-          <w:hyperlink w:anchor="_Toc243599175" w:history="1">
+          <w:hyperlink w:anchor="_Toc243599881" w:history="1">
             <w:r>
               <w:rPr>
                 <w:rStyle w:val="Hyperlink"/>
@@ -1111,7 +1056,7 @@
                 <w:noProof/>
                 <w:webHidden/>
               </w:rPr>
-              <w:instrText xml:space="preserve"> PAGEREF _Toc243599175 \h </w:instrText>
+              <w:instrText xml:space="preserve"> PAGEREF _Toc243599881 \h </w:instrText>
             </w:r>
             <w:r>
               <w:rPr>
@@ -1157,7 +1102,7 @@
               <w14:ligatures w14:val="standardContextual"/>
             </w:rPr>
           </w:pPr>
-          <w:hyperlink w:anchor="_Toc243599176" w:history="1">
+          <w:hyperlink w:anchor="_Toc243599882" w:history="1">
             <w:r>
               <w:rPr>
                 <w:rStyle w:val="Hyperlink"/>
@@ -1185,7 +1130,7 @@
                 <w:noProof/>
                 <w:webHidden/>
               </w:rPr>
-              <w:instrText xml:space="preserve"> PAGEREF _Toc243599176 \h </w:instrText>
+              <w:instrText xml:space="preserve"> PAGEREF _Toc243599882 \h </w:instrText>
             </w:r>
             <w:r>
               <w:rPr>
@@ -1231,7 +1176,7 @@
               <w14:ligatures w14:val="standardContextual"/>
             </w:rPr>
           </w:pPr>
-          <w:hyperlink w:anchor="_Toc243599177" w:history="1">
+          <w:hyperlink w:anchor="_Toc243599883" w:history="1">
             <w:r>
               <w:rPr>
                 <w:rStyle w:val="Hyperlink"/>
@@ -1259,7 +1204,7 @@
                 <w:noProof/>
                 <w:webHidden/>
               </w:rPr>
-              <w:instrText xml:space="preserve"> PAGEREF _Toc243599177 \h </w:instrText>
+              <w:instrText xml:space="preserve"> PAGEREF _Toc243599883 \h </w:instrText>
             </w:r>
             <w:r>
               <w:rPr>
@@ -1305,7 +1250,7 @@
               <w14:ligatures w14:val="standardContextual"/>
             </w:rPr>
           </w:pPr>
-          <w:hyperlink w:anchor="_Toc243599178" w:history="1">
+          <w:hyperlink w:anchor="_Toc243599884" w:history="1">
             <w:r>
               <w:rPr>
                 <w:rStyle w:val="Hyperlink"/>
@@ -1333,7 +1278,7 @@
                 <w:noProof/>
                 <w:webHidden/>
               </w:rPr>
-              <w:instrText xml:space="preserve"> PAGEREF _Toc243599178 \h </w:instrText>
+              <w:instrText xml:space="preserve"> PAGEREF _Toc243599884 \h </w:instrText>
             </w:r>
             <w:r>
               <w:rPr>
@@ -1379,7 +1324,7 @@
               <w14:ligatures w14:val="standardContextual"/>
             </w:rPr>
           </w:pPr>
-          <w:hyperlink w:anchor="_Toc243599179" w:history="1">
+          <w:hyperlink w:anchor="_Toc243599885" w:history="1">
             <w:r>
               <w:rPr>
                 <w:rStyle w:val="Hyperlink"/>
@@ -1407,7 +1352,7 @@
                 <w:noProof/>
                 <w:webHidden/>
               </w:rPr>
-              <w:instrText xml:space="preserve"> PAGEREF _Toc243599179 \h </w:instrText>
+              <w:instrText xml:space="preserve"> PAGEREF _Toc243599885 \h </w:instrText>
             </w:r>
             <w:r>
               <w:rPr>
@@ -1453,7 +1398,7 @@
               <w14:ligatures w14:val="standardContextual"/>
             </w:rPr>
           </w:pPr>
-          <w:hyperlink w:anchor="_Toc243599180" w:history="1">
+          <w:hyperlink w:anchor="_Toc243599886" w:history="1">
             <w:r>
               <w:rPr>
                 <w:rStyle w:val="Hyperlink"/>
@@ -1481,7 +1426,7 @@
                 <w:noProof/>
                 <w:webHidden/>
               </w:rPr>
-              <w:instrText xml:space="preserve"> PAGEREF _Toc243599180 \h </w:instrText>
+              <w:instrText xml:space="preserve"> PAGEREF _Toc243599886 \h </w:instrText>
             </w:r>
             <w:r>
               <w:rPr>
@@ -1527,7 +1472,7 @@
               <w14:ligatures w14:val="standardContextual"/>
             </w:rPr>
           </w:pPr>
-          <w:hyperlink w:anchor="_Toc243599181" w:history="1">
+          <w:hyperlink w:anchor="_Toc243599887" w:history="1">
             <w:r>
               <w:rPr>
                 <w:rStyle w:val="Hyperlink"/>
@@ -1555,7 +1500,7 @@
                 <w:noProof/>
                 <w:webHidden/>
               </w:rPr>
-              <w:instrText xml:space="preserve"> PAGEREF _Toc243599181 \h </w:instrText>
+              <w:instrText xml:space="preserve"> PAGEREF _Toc243599887 \h </w:instrText>
             </w:r>
             <w:r>
               <w:rPr>
@@ -1601,7 +1546,7 @@
               <w14:ligatures w14:val="standardContextual"/>
             </w:rPr>
           </w:pPr>
-          <w:hyperlink w:anchor="_Toc243599182" w:history="1">
+          <w:hyperlink w:anchor="_Toc243599888" w:history="1">
             <w:r>
               <w:rPr>
                 <w:rStyle w:val="Hyperlink"/>
@@ -1629,7 +1574,7 @@
                 <w:noProof/>
                 <w:webHidden/>
               </w:rPr>
-              <w:instrText xml:space="preserve"> PAGEREF _Toc243599182 \h </w:instrText>
+              <w:instrText xml:space="preserve"> PAGEREF _Toc243599888 \h </w:instrText>
             </w:r>
             <w:r>
               <w:rPr>
@@ -1675,7 +1620,7 @@
               <w14:ligatures w14:val="standardContextual"/>
             </w:rPr>
           </w:pPr>
-          <w:hyperlink w:anchor="_Toc243599183" w:history="1">
+          <w:hyperlink w:anchor="_Toc243599889" w:history="1">
             <w:r>
               <w:rPr>
                 <w:rStyle w:val="Hyperlink"/>
@@ -1703,7 +1648,7 @@
                 <w:noProof/>
                 <w:webHidden/>
               </w:rPr>
-              <w:instrText xml:space="preserve"> PAGEREF _Toc243599183 \h </w:instrText>
+              <w:instrText xml:space="preserve"> PAGEREF _Toc243599889 \h </w:instrText>
             </w:r>
             <w:r>
               <w:rPr>
@@ -1749,7 +1694,7 @@
               <w14:ligatures w14:val="standardContextual"/>
             </w:rPr>
           </w:pPr>
-          <w:hyperlink w:anchor="_Toc243599184" w:history="1">
+          <w:hyperlink w:anchor="_Toc243599890" w:history="1">
             <w:r>
               <w:rPr>
                 <w:rStyle w:val="Hyperlink"/>
@@ -1777,7 +1722,7 @@
                 <w:noProof/>
                 <w:webHidden/>
               </w:rPr>
-              <w:instrText xml:space="preserve"> PAGEREF _Toc243599184 \h </w:instrText>
+              <w:instrText xml:space="preserve"> PAGEREF _Toc243599890 \h </w:instrText>
             </w:r>
             <w:r>
               <w:rPr>
@@ -1823,7 +1768,7 @@
               <w14:ligatures w14:val="standardContextual"/>
             </w:rPr>
           </w:pPr>
-          <w:hyperlink w:anchor="_Toc243599185" w:history="1">
+          <w:hyperlink w:anchor="_Toc243599891" w:history="1">
             <w:r>
               <w:rPr>
                 <w:rStyle w:val="Hyperlink"/>
@@ -1851,7 +1796,7 @@
                 <w:noProof/>
                 <w:webHidden/>
               </w:rPr>
-              <w:instrText xml:space="preserve"> PAGEREF _Toc243599185 \h </w:instrText>
+              <w:instrText xml:space="preserve"> PAGEREF _Toc243599891 \h </w:instrText>
             </w:r>
             <w:r>
               <w:rPr>
@@ -1898,7 +1843,7 @@
               <w14:ligatures w14:val="standardContextual"/>
             </w:rPr>
           </w:pPr>
-          <w:hyperlink w:anchor="_Toc243599186" w:history="1">
+          <w:hyperlink w:anchor="_Toc243599892" w:history="1">
             <w:r>
               <w:rPr>
                 <w:rStyle w:val="Hyperlink"/>
@@ -1926,7 +1871,7 @@
                 <w:noProof/>
                 <w:webHidden/>
               </w:rPr>
-              <w:instrText xml:space="preserve"> PAGEREF _Toc243599186 \h </w:instrText>
+              <w:instrText xml:space="preserve"> PAGEREF _Toc243599892 \h </w:instrText>
             </w:r>
             <w:r>
               <w:rPr>
@@ -1972,7 +1917,7 @@
               <w14:ligatures w14:val="standardContextual"/>
             </w:rPr>
           </w:pPr>
-          <w:hyperlink w:anchor="_Toc243599187" w:history="1">
+          <w:hyperlink w:anchor="_Toc243599893" w:history="1">
             <w:r>
               <w:rPr>
                 <w:rStyle w:val="Hyperlink"/>
@@ -2000,7 +1945,7 @@
                 <w:noProof/>
                 <w:webHidden/>
               </w:rPr>
-              <w:instrText xml:space="preserve"> PAGEREF _Toc243599187 \h </w:instrText>
+              <w:instrText xml:space="preserve"> PAGEREF _Toc243599893 \h </w:instrText>
             </w:r>
             <w:r>
               <w:rPr>
@@ -2046,7 +1991,7 @@
               <w14:ligatures w14:val="standardContextual"/>
             </w:rPr>
           </w:pPr>
-          <w:hyperlink w:anchor="_Toc243599188" w:history="1">
+          <w:hyperlink w:anchor="_Toc243599894" w:history="1">
             <w:r>
               <w:rPr>
                 <w:rStyle w:val="Hyperlink"/>
@@ -2074,7 +2019,7 @@
                 <w:noProof/>
                 <w:webHidden/>
               </w:rPr>
-              <w:instrText xml:space="preserve"> PAGEREF _Toc243599188 \h </w:instrText>
+              <w:instrText xml:space="preserve"> PAGEREF _Toc243599894 \h </w:instrText>
             </w:r>
             <w:r>
               <w:rPr>
@@ -2121,7 +2066,7 @@
               <w14:ligatures w14:val="standardContextual"/>
             </w:rPr>
           </w:pPr>
-          <w:hyperlink w:anchor="_Toc243599189" w:history="1">
+          <w:hyperlink w:anchor="_Toc243599895" w:history="1">
             <w:r>
               <w:rPr>
                 <w:rStyle w:val="Hyperlink"/>
@@ -2149,7 +2094,7 @@
                 <w:noProof/>
                 <w:webHidden/>
               </w:rPr>
-              <w:instrText xml:space="preserve"> PAGEREF _Toc243599189 \h </w:instrText>
+              <w:instrText xml:space="preserve"> PAGEREF _Toc243599895 \h </w:instrText>
             </w:r>
             <w:r>
               <w:rPr>
@@ -2195,7 +2140,7 @@
               <w14:ligatures w14:val="standardContextual"/>
             </w:rPr>
           </w:pPr>
-          <w:hyperlink w:anchor="_Toc243599190" w:history="1">
+          <w:hyperlink w:anchor="_Toc243599896" w:history="1">
             <w:r>
               <w:rPr>
                 <w:rStyle w:val="Hyperlink"/>
@@ -2223,7 +2168,7 @@
                 <w:noProof/>
                 <w:webHidden/>
               </w:rPr>
-              <w:instrText xml:space="preserve"> PAGEREF _Toc243599190 \h </w:instrText>
+              <w:instrText xml:space="preserve"> PAGEREF _Toc243599896 \h </w:instrText>
             </w:r>
             <w:r>
               <w:rPr>
@@ -2269,7 +2214,7 @@
               <w14:ligatures w14:val="standardContextual"/>
             </w:rPr>
           </w:pPr>
-          <w:hyperlink w:anchor="_Toc243599191" w:history="1">
+          <w:hyperlink w:anchor="_Toc243599897" w:history="1">
             <w:r>
               <w:rPr>
                 <w:rStyle w:val="Hyperlink"/>
@@ -2297,7 +2242,7 @@
                 <w:noProof/>
                 <w:webHidden/>
               </w:rPr>
-              <w:instrText xml:space="preserve"> PAGEREF _Toc243599191 \h </w:instrText>
+              <w:instrText xml:space="preserve"> PAGEREF _Toc243599897 \h </w:instrText>
             </w:r>
             <w:r>
               <w:rPr>
@@ -2343,7 +2288,7 @@
               <w14:ligatures w14:val="standardContextual"/>
             </w:rPr>
           </w:pPr>
-          <w:hyperlink w:anchor="_Toc243599192" w:history="1">
+          <w:hyperlink w:anchor="_Toc243599898" w:history="1">
             <w:r>
               <w:rPr>
                 <w:rStyle w:val="Hyperlink"/>
@@ -2371,7 +2316,7 @@
                 <w:noProof/>
                 <w:webHidden/>
               </w:rPr>
-              <w:instrText xml:space="preserve"> PAGEREF _Toc243599192 \h </w:instrText>
+              <w:instrText xml:space="preserve"> PAGEREF _Toc243599898 \h </w:instrText>
             </w:r>
             <w:r>
               <w:rPr>
@@ -2417,7 +2362,7 @@
               <w14:ligatures w14:val="standardContextual"/>
             </w:rPr>
           </w:pPr>
-          <w:hyperlink w:anchor="_Toc243599193" w:history="1">
+          <w:hyperlink w:anchor="_Toc243599899" w:history="1">
             <w:r>
               <w:rPr>
                 <w:rStyle w:val="Hyperlink"/>
@@ -2445,7 +2390,7 @@
                 <w:noProof/>
                 <w:webHidden/>
               </w:rPr>
-              <w:instrText xml:space="preserve"> PAGEREF _Toc243599193 \h </w:instrText>
+              <w:instrText xml:space="preserve"> PAGEREF _Toc243599899 \h </w:instrText>
             </w:r>
             <w:r>
               <w:rPr>
@@ -2491,7 +2436,7 @@
               <w14:ligatures w14:val="standardContextual"/>
             </w:rPr>
           </w:pPr>
-          <w:hyperlink w:anchor="_Toc243599194" w:history="1">
+          <w:hyperlink w:anchor="_Toc243599900" w:history="1">
             <w:r>
               <w:rPr>
                 <w:rStyle w:val="Hyperlink"/>
@@ -2519,7 +2464,7 @@
                 <w:noProof/>
                 <w:webHidden/>
               </w:rPr>
-              <w:instrText xml:space="preserve"> PAGEREF _Toc243599194 \h </w:instrText>
+              <w:instrText xml:space="preserve"> PAGEREF _Toc243599900 \h </w:instrText>
             </w:r>
             <w:r>
               <w:rPr>
@@ -2566,7 +2511,7 @@
               <w14:ligatures w14:val="standardContextual"/>
             </w:rPr>
           </w:pPr>
-          <w:hyperlink w:anchor="_Toc243599195" w:history="1">
+          <w:hyperlink w:anchor="_Toc243599901" w:history="1">
             <w:r>
               <w:rPr>
                 <w:rStyle w:val="Hyperlink"/>
@@ -2594,7 +2539,7 @@
                 <w:noProof/>
                 <w:webHidden/>
               </w:rPr>
-              <w:instrText xml:space="preserve"> PAGEREF _Toc243599195 \h </w:instrText>
+              <w:instrText xml:space="preserve"> PAGEREF _Toc243599901 \h </w:instrText>
             </w:r>
             <w:r>
               <w:rPr>
@@ -2640,7 +2585,7 @@
               <w14:ligatures w14:val="standardContextual"/>
             </w:rPr>
           </w:pPr>
-          <w:hyperlink w:anchor="_Toc243599196" w:history="1">
+          <w:hyperlink w:anchor="_Toc243599902" w:history="1">
             <w:r>
               <w:rPr>
                 <w:rStyle w:val="Hyperlink"/>
@@ -2668,7 +2613,7 @@
                 <w:noProof/>
                 <w:webHidden/>
               </w:rPr>
-              <w:instrText xml:space="preserve"> PAGEREF _Toc243599196 \h </w:instrText>
+              <w:instrText xml:space="preserve"> PAGEREF _Toc243599902 \h </w:instrText>
             </w:r>
             <w:r>
               <w:rPr>
@@ -2714,7 +2659,7 @@
               <w14:ligatures w14:val="standardContextual"/>
             </w:rPr>
           </w:pPr>
-          <w:hyperlink w:anchor="_Toc243599197" w:history="1">
+          <w:hyperlink w:anchor="_Toc243599903" w:history="1">
             <w:r>
               <w:rPr>
                 <w:rStyle w:val="Hyperlink"/>
@@ -2742,7 +2687,7 @@
                 <w:noProof/>
                 <w:webHidden/>
               </w:rPr>
-              <w:instrText xml:space="preserve"> PAGEREF _Toc243599197 \h </w:instrText>
+              <w:instrText xml:space="preserve"> PAGEREF _Toc243599903 \h </w:instrText>
             </w:r>
             <w:r>
               <w:rPr>
@@ -2788,7 +2733,7 @@
               <w14:ligatures w14:val="standardContextual"/>
             </w:rPr>
           </w:pPr>
-          <w:hyperlink w:anchor="_Toc243599198" w:history="1">
+          <w:hyperlink w:anchor="_Toc243599904" w:history="1">
             <w:r>
               <w:rPr>
                 <w:rStyle w:val="Hyperlink"/>
@@ -2816,7 +2761,7 @@
                 <w:noProof/>
                 <w:webHidden/>
               </w:rPr>
-              <w:instrText xml:space="preserve"> PAGEREF _Toc243599198 \h </w:instrText>
+              <w:instrText xml:space="preserve"> PAGEREF _Toc243599904 \h </w:instrText>
             </w:r>
             <w:r>
               <w:rPr>
@@ -2862,7 +2807,7 @@
               <w14:ligatures w14:val="standardContextual"/>
             </w:rPr>
           </w:pPr>
-          <w:hyperlink w:anchor="_Toc243599199" w:history="1">
+          <w:hyperlink w:anchor="_Toc243599905" w:history="1">
             <w:r>
               <w:rPr>
                 <w:rStyle w:val="Hyperlink"/>
@@ -2890,7 +2835,7 @@
                 <w:noProof/>
                 <w:webHidden/>
               </w:rPr>
-              <w:instrText xml:space="preserve"> PAGEREF _Toc243599199 \h </w:instrText>
+              <w:instrText xml:space="preserve"> PAGEREF _Toc243599905 \h </w:instrText>
             </w:r>
             <w:r>
               <w:rPr>
@@ -2936,7 +2881,7 @@
               <w14:ligatures w14:val="standardContextual"/>
             </w:rPr>
           </w:pPr>
-          <w:hyperlink w:anchor="_Toc243599200" w:history="1">
+          <w:hyperlink w:anchor="_Toc243599906" w:history="1">
             <w:r>
               <w:rPr>
                 <w:rStyle w:val="Hyperlink"/>
@@ -2964,7 +2909,7 @@
                 <w:noProof/>
                 <w:webHidden/>
               </w:rPr>
-              <w:instrText xml:space="preserve"> PAGEREF _Toc243599200 \h </w:instrText>
+              <w:instrText xml:space="preserve"> PAGEREF _Toc243599906 \h </w:instrText>
             </w:r>
             <w:r>
               <w:rPr>
@@ -3014,7 +2959,7 @@
         </w:numPr>
       </w:pPr>
       <w:bookmarkStart w:id="5" w:name="_Toc175554962"/>
-      <w:bookmarkStart w:id="6" w:name="_Toc243599170"/>
+      <w:bookmarkStart w:id="6" w:name="_Toc243599876"/>
       <w:r>
         <w:t>Phân công thực hiện đồ án</w:t>
       </w:r>
@@ -3037,8 +2982,7 @@
       <w:tblGrid>
         <w:gridCol w:w="1310"/>
         <w:gridCol w:w="2059"/>
-        <w:gridCol w:w="1310"/>
-        <w:gridCol w:w="4681"/>
+        <w:gridCol w:w="5991"/>
       </w:tblGrid>
       <w:tr>
         <w:trPr>
@@ -3091,29 +3035,7 @@
         </w:tc>
         <w:tc>
           <w:tcPr>
-            <w:tcW w:w="1310" w:type="dxa"/>
-            <w:shd w:val="clear" w:color="auto" w:fill="D9E2F3"/>
-            <w:vAlign w:val="center"/>
-          </w:tcPr>
-          <w:p>
-            <w:pPr>
-              <w:jc w:val="center"/>
-            </w:pPr>
-            <w:r>
-              <w:rPr>
-                <w:b/>
-                <w:bCs/>
-                <w:sz w:val="22"/>
-                <w:szCs w:val="22"/>
-                <w:lang w:val="vi-VN"/>
-              </w:rPr>
-              <w:t>Lớp</w:t>
-            </w:r>
-          </w:p>
-        </w:tc>
-        <w:tc>
-          <w:tcPr>
-            <w:tcW w:w="4681" w:type="dxa"/>
+            <w:tcW w:w="5991" w:type="dxa"/>
             <w:shd w:val="clear" w:color="auto" w:fill="D9E2F3"/>
             <w:vAlign w:val="center"/>
           </w:tcPr>
@@ -3178,27 +3100,7 @@
         </w:tc>
         <w:tc>
           <w:tcPr>
-            <w:tcW w:w="1310" w:type="dxa"/>
-            <w:vAlign w:val="center"/>
-          </w:tcPr>
-          <w:p>
-            <w:pPr>
-              <w:jc w:val="center"/>
-            </w:pPr>
-            <w:r>
-              <w:rPr>
-                <w:sz w:val="22"/>
-                <w:szCs w:val="22"/>
-                <w:highlight w:val="yellow"/>
-                <w:lang w:val="vi-VN"/>
-              </w:rPr>
-              <w:t>[Điền vào]</w:t>
-            </w:r>
-          </w:p>
-        </w:tc>
-        <w:tc>
-          <w:tcPr>
-            <w:tcW w:w="4681" w:type="dxa"/>
+            <w:tcW w:w="5991" w:type="dxa"/>
             <w:vAlign w:val="center"/>
           </w:tcPr>
           <w:p>
@@ -3722,7 +3624,7 @@
           <w:numId w:val="0"/>
         </w:numPr>
       </w:pPr>
-      <w:bookmarkStart w:id="7" w:name="_Toc243599171"/>
+      <w:bookmarkStart w:id="7" w:name="_Toc243599877"/>
       <w:r>
         <w:rPr>
           <w:lang w:val="vi-VN"/>
@@ -3740,7 +3642,7 @@
           <w:numId w:val="0"/>
         </w:numPr>
       </w:pPr>
-      <w:bookmarkStart w:id="8" w:name="_Toc243599172"/>
+      <w:bookmarkStart w:id="8" w:name="_Toc243599878"/>
       <w:r>
         <w:rPr>
           <w:lang w:val="vi-VN"/>
@@ -3874,7 +3776,7 @@
           <w:numId w:val="0"/>
         </w:numPr>
       </w:pPr>
-      <w:bookmarkStart w:id="9" w:name="_Toc243599173"/>
+      <w:bookmarkStart w:id="9" w:name="_Toc243599879"/>
       <w:r>
         <w:rPr>
           <w:lang w:val="vi-VN"/>
@@ -3896,7 +3798,7 @@
         <w:pStyle w:val="Caption"/>
         <w:keepNext/>
       </w:pPr>
-      <w:bookmarkStart w:id="10" w:name="_Toc243599020"/>
+      <w:bookmarkStart w:id="10" w:name="_Toc243599801"/>
       <w:r>
         <w:rPr>
           <w:b/>
@@ -6634,7 +6536,7 @@
           <w:numId w:val="0"/>
         </w:numPr>
       </w:pPr>
-      <w:bookmarkStart w:id="11" w:name="_Toc243599174"/>
+      <w:bookmarkStart w:id="11" w:name="_Toc243599880"/>
       <w:r>
         <w:rPr>
           <w:lang w:val="vi-VN"/>
@@ -6657,7 +6559,7 @@
         <w:pStyle w:val="Caption"/>
         <w:keepNext/>
       </w:pPr>
-      <w:bookmarkStart w:id="12" w:name="_Toc243599021"/>
+      <w:bookmarkStart w:id="12" w:name="_Toc243599802"/>
       <w:r>
         <w:rPr>
           <w:b/>
@@ -8624,7 +8526,7 @@
           <w:numId w:val="0"/>
         </w:numPr>
       </w:pPr>
-      <w:bookmarkStart w:id="13" w:name="_Toc243599175"/>
+      <w:bookmarkStart w:id="13" w:name="_Toc243599881"/>
       <w:r>
         <w:rPr>
           <w:lang w:val="vi-VN"/>
@@ -8666,7 +8568,7 @@
         <w:pStyle w:val="Caption"/>
         <w:keepNext/>
       </w:pPr>
-      <w:bookmarkStart w:id="14" w:name="_Toc243599022"/>
+      <w:bookmarkStart w:id="14" w:name="_Toc243599803"/>
       <w:r>
         <w:rPr>
           <w:b/>
@@ -10581,7 +10483,7 @@
           <w:numId w:val="0"/>
         </w:numPr>
       </w:pPr>
-      <w:bookmarkStart w:id="15" w:name="_Toc243599176"/>
+      <w:bookmarkStart w:id="15" w:name="_Toc243599882"/>
       <w:r>
         <w:rPr>
           <w:lang w:val="vi-VN"/>
@@ -10599,7 +10501,7 @@
           <w:numId w:val="0"/>
         </w:numPr>
       </w:pPr>
-      <w:bookmarkStart w:id="16" w:name="_Toc243599177"/>
+      <w:bookmarkStart w:id="16" w:name="_Toc243599883"/>
       <w:r>
         <w:rPr>
           <w:lang w:val="vi-VN"/>
@@ -10621,7 +10523,7 @@
         <w:pStyle w:val="Caption"/>
         <w:keepNext/>
       </w:pPr>
-      <w:bookmarkStart w:id="17" w:name="_Toc243599023"/>
+      <w:bookmarkStart w:id="17" w:name="_Toc243599804"/>
       <w:r>
         <w:rPr>
           <w:b/>
@@ -11475,7 +11377,7 @@
           <w:numId w:val="0"/>
         </w:numPr>
       </w:pPr>
-      <w:bookmarkStart w:id="18" w:name="_Toc243599178"/>
+      <w:bookmarkStart w:id="18" w:name="_Toc243599884"/>
       <w:r>
         <w:rPr>
           <w:lang w:val="vi-VN"/>
@@ -11523,7 +11425,7 @@
           <w:numId w:val="0"/>
         </w:numPr>
       </w:pPr>
-      <w:bookmarkStart w:id="19" w:name="_Toc243599179"/>
+      <w:bookmarkStart w:id="19" w:name="_Toc243599885"/>
       <w:r>
         <w:rPr>
           <w:lang w:val="vi-VN"/>
@@ -11631,7 +11533,7 @@
           <w:numId w:val="0"/>
         </w:numPr>
       </w:pPr>
-      <w:bookmarkStart w:id="20" w:name="_Toc243599180"/>
+      <w:bookmarkStart w:id="20" w:name="_Toc243599886"/>
       <w:r>
         <w:rPr>
           <w:lang w:val="vi-VN"/>
@@ -11650,7 +11552,7 @@
           <w:numId w:val="0"/>
         </w:numPr>
       </w:pPr>
-      <w:bookmarkStart w:id="21" w:name="_Toc243599181"/>
+      <w:bookmarkStart w:id="21" w:name="_Toc243599887"/>
       <w:r>
         <w:rPr>
           <w:lang w:val="vi-VN"/>
@@ -11693,7 +11595,7 @@
         <w:pStyle w:val="Caption"/>
         <w:keepNext/>
       </w:pPr>
-      <w:bookmarkStart w:id="22" w:name="_Toc243599024"/>
+      <w:bookmarkStart w:id="22" w:name="_Toc243599805"/>
       <w:r>
         <w:rPr>
           <w:b/>
@@ -13850,7 +13752,7 @@
           <w:numId w:val="0"/>
         </w:numPr>
       </w:pPr>
-      <w:bookmarkStart w:id="23" w:name="_Toc243599182"/>
+      <w:bookmarkStart w:id="23" w:name="_Toc243599888"/>
       <w:r>
         <w:rPr>
           <w:lang w:val="vi-VN"/>
@@ -13932,7 +13834,7 @@
       <w:pPr>
         <w:pStyle w:val="Caption"/>
       </w:pPr>
-      <w:bookmarkStart w:id="24" w:name="_Toc243599079"/>
+      <w:bookmarkStart w:id="24" w:name="_Toc243599860"/>
       <w:r>
         <w:rPr>
           <w:b/>
@@ -13965,7 +13867,7 @@
           <w:numId w:val="0"/>
         </w:numPr>
       </w:pPr>
-      <w:bookmarkStart w:id="25" w:name="_Toc243599183"/>
+      <w:bookmarkStart w:id="25" w:name="_Toc243599889"/>
       <w:r>
         <w:rPr>
           <w:lang w:val="vi-VN"/>
@@ -14099,7 +14001,7 @@
       <w:pPr>
         <w:pStyle w:val="Caption"/>
       </w:pPr>
-      <w:bookmarkStart w:id="26" w:name="_Toc243599080"/>
+      <w:bookmarkStart w:id="26" w:name="_Toc243599861"/>
       <w:r>
         <w:rPr>
           <w:b/>
@@ -14217,7 +14119,7 @@
           <w:numId w:val="0"/>
         </w:numPr>
       </w:pPr>
-      <w:bookmarkStart w:id="27" w:name="_Toc243599184"/>
+      <w:bookmarkStart w:id="27" w:name="_Toc243599890"/>
       <w:r>
         <w:rPr>
           <w:lang w:val="vi-VN"/>
@@ -14286,7 +14188,7 @@
       <w:pPr>
         <w:pStyle w:val="Caption"/>
       </w:pPr>
-      <w:bookmarkStart w:id="28" w:name="_Toc243599081"/>
+      <w:bookmarkStart w:id="28" w:name="_Toc243599862"/>
       <w:r>
         <w:rPr>
           <w:b/>
@@ -14362,7 +14264,7 @@
       <w:pPr>
         <w:pStyle w:val="Caption"/>
       </w:pPr>
-      <w:bookmarkStart w:id="29" w:name="_Toc243599082"/>
+      <w:bookmarkStart w:id="29" w:name="_Toc243599863"/>
       <w:r>
         <w:rPr>
           <w:b/>
@@ -14460,7 +14362,7 @@
       <w:pPr>
         <w:pStyle w:val="Caption"/>
       </w:pPr>
-      <w:bookmarkStart w:id="30" w:name="_Toc243599083"/>
+      <w:bookmarkStart w:id="30" w:name="_Toc243599864"/>
       <w:r>
         <w:rPr>
           <w:b/>
@@ -14535,7 +14437,7 @@
       <w:pPr>
         <w:pStyle w:val="Caption"/>
       </w:pPr>
-      <w:bookmarkStart w:id="31" w:name="_Toc243599084"/>
+      <w:bookmarkStart w:id="31" w:name="_Toc243599865"/>
       <w:r>
         <w:rPr>
           <w:b/>
@@ -14568,7 +14470,7 @@
           <w:numId w:val="0"/>
         </w:numPr>
       </w:pPr>
-      <w:bookmarkStart w:id="32" w:name="_Toc243599185"/>
+      <w:bookmarkStart w:id="32" w:name="_Toc243599891"/>
       <w:r>
         <w:rPr>
           <w:lang w:val="vi-VN"/>
@@ -14591,7 +14493,7 @@
         <w:pStyle w:val="Caption"/>
         <w:keepNext/>
       </w:pPr>
-      <w:bookmarkStart w:id="33" w:name="_Toc243599025"/>
+      <w:bookmarkStart w:id="33" w:name="_Toc243599806"/>
       <w:r>
         <w:rPr>
           <w:b/>
@@ -15626,7 +15528,7 @@
       <w:pPr>
         <w:pStyle w:val="Caption"/>
       </w:pPr>
-      <w:bookmarkStart w:id="34" w:name="_Toc243599085"/>
+      <w:bookmarkStart w:id="34" w:name="_Toc243599866"/>
       <w:r>
         <w:rPr>
           <w:b/>
@@ -15723,7 +15625,7 @@
       <w:pPr>
         <w:pStyle w:val="Caption"/>
       </w:pPr>
-      <w:bookmarkStart w:id="35" w:name="_Toc243599086"/>
+      <w:bookmarkStart w:id="35" w:name="_Toc243599867"/>
       <w:r>
         <w:rPr>
           <w:b/>
@@ -15821,7 +15723,7 @@
       <w:pPr>
         <w:pStyle w:val="Caption"/>
       </w:pPr>
-      <w:bookmarkStart w:id="36" w:name="_Toc243599087"/>
+      <w:bookmarkStart w:id="36" w:name="_Toc243599868"/>
       <w:r>
         <w:rPr>
           <w:b/>
@@ -15876,7 +15778,7 @@
           <w:numId w:val="0"/>
         </w:numPr>
       </w:pPr>
-      <w:bookmarkStart w:id="37" w:name="_Toc243599186"/>
+      <w:bookmarkStart w:id="37" w:name="_Toc243599892"/>
       <w:r>
         <w:rPr>
           <w:lang w:val="vi-VN"/>
@@ -15894,7 +15796,7 @@
           <w:numId w:val="0"/>
         </w:numPr>
       </w:pPr>
-      <w:bookmarkStart w:id="38" w:name="_Toc243599187"/>
+      <w:bookmarkStart w:id="38" w:name="_Toc243599893"/>
       <w:r>
         <w:rPr>
           <w:lang w:val="vi-VN"/>
@@ -16114,7 +16016,7 @@
         <w:pStyle w:val="Caption"/>
         <w:keepNext/>
       </w:pPr>
-      <w:bookmarkStart w:id="39" w:name="_Toc243599032"/>
+      <w:bookmarkStart w:id="39" w:name="_Toc243599813"/>
       <w:r>
         <w:rPr>
           <w:b/>
@@ -16500,7 +16402,7 @@
           <w:numId w:val="0"/>
         </w:numPr>
       </w:pPr>
-      <w:bookmarkStart w:id="40" w:name="_Toc243599188"/>
+      <w:bookmarkStart w:id="40" w:name="_Toc243599894"/>
       <w:r>
         <w:rPr>
           <w:lang w:val="vi-VN"/>
@@ -16591,7 +16493,7 @@
         <w:pStyle w:val="Caption"/>
         <w:keepNext/>
       </w:pPr>
-      <w:bookmarkStart w:id="41" w:name="_Toc243599033"/>
+      <w:bookmarkStart w:id="41" w:name="_Toc243599814"/>
       <w:r>
         <w:rPr>
           <w:b/>
@@ -17060,7 +16962,7 @@
         <w:pStyle w:val="Caption"/>
         <w:keepNext/>
       </w:pPr>
-      <w:bookmarkStart w:id="42" w:name="_Toc243599034"/>
+      <w:bookmarkStart w:id="42" w:name="_Toc243599815"/>
       <w:r>
         <w:rPr>
           <w:b/>
@@ -18041,7 +17943,7 @@
       <w:pPr>
         <w:pStyle w:val="Caption"/>
       </w:pPr>
-      <w:bookmarkStart w:id="43" w:name="_Toc243599090"/>
+      <w:bookmarkStart w:id="43" w:name="_Toc243599871"/>
       <w:r>
         <w:rPr>
           <w:b/>
@@ -18173,7 +18075,7 @@
           <w:numId w:val="0"/>
         </w:numPr>
       </w:pPr>
-      <w:bookmarkStart w:id="44" w:name="_Toc243599189"/>
+      <w:bookmarkStart w:id="44" w:name="_Toc243599895"/>
       <w:r>
         <w:rPr>
           <w:lang w:val="vi-VN"/>
@@ -18191,7 +18093,7 @@
           <w:numId w:val="0"/>
         </w:numPr>
       </w:pPr>
-      <w:bookmarkStart w:id="45" w:name="_Toc243599190"/>
+      <w:bookmarkStart w:id="45" w:name="_Toc243599896"/>
       <w:r>
         <w:rPr>
           <w:lang w:val="vi-VN"/>
@@ -18213,7 +18115,7 @@
         <w:pStyle w:val="Caption"/>
         <w:keepNext/>
       </w:pPr>
-      <w:bookmarkStart w:id="46" w:name="_Toc243599042"/>
+      <w:bookmarkStart w:id="46" w:name="_Toc243599823"/>
       <w:r>
         <w:rPr>
           <w:b/>
@@ -19182,7 +19084,7 @@
         <w:pStyle w:val="Caption"/>
         <w:keepNext/>
       </w:pPr>
-      <w:bookmarkStart w:id="47" w:name="_Toc243599043"/>
+      <w:bookmarkStart w:id="47" w:name="_Toc243599824"/>
       <w:r>
         <w:rPr>
           <w:b/>
@@ -20011,7 +19913,7 @@
           <w:numId w:val="0"/>
         </w:numPr>
       </w:pPr>
-      <w:bookmarkStart w:id="48" w:name="_Toc243599191"/>
+      <w:bookmarkStart w:id="48" w:name="_Toc243599897"/>
       <w:r>
         <w:rPr>
           <w:lang w:val="vi-VN"/>
@@ -20029,7 +19931,7 @@
           <w:numId w:val="0"/>
         </w:numPr>
       </w:pPr>
-      <w:bookmarkStart w:id="49" w:name="_Toc243599192"/>
+      <w:bookmarkStart w:id="49" w:name="_Toc243599898"/>
       <w:r>
         <w:rPr>
           <w:lang w:val="vi-VN"/>
@@ -20051,7 +19953,7 @@
         <w:pStyle w:val="Caption"/>
         <w:keepNext/>
       </w:pPr>
-      <w:bookmarkStart w:id="50" w:name="_Toc243599044"/>
+      <w:bookmarkStart w:id="50" w:name="_Toc243599825"/>
       <w:r>
         <w:rPr>
           <w:b/>
@@ -20582,7 +20484,7 @@
           <w:numId w:val="0"/>
         </w:numPr>
       </w:pPr>
-      <w:bookmarkStart w:id="51" w:name="_Toc243599193"/>
+      <w:bookmarkStart w:id="51" w:name="_Toc243599899"/>
       <w:r>
         <w:rPr>
           <w:lang w:val="vi-VN"/>
@@ -20604,7 +20506,7 @@
         <w:pStyle w:val="Caption"/>
         <w:keepNext/>
       </w:pPr>
-      <w:bookmarkStart w:id="52" w:name="_Toc243599045"/>
+      <w:bookmarkStart w:id="52" w:name="_Toc243599826"/>
       <w:r>
         <w:rPr>
           <w:b/>
@@ -22594,7 +22496,7 @@
           <w:numId w:val="0"/>
         </w:numPr>
       </w:pPr>
-      <w:bookmarkStart w:id="53" w:name="_Toc243599194"/>
+      <w:bookmarkStart w:id="53" w:name="_Toc243599900"/>
       <w:r>
         <w:rPr>
           <w:lang w:val="vi-VN"/>
@@ -22616,7 +22518,7 @@
         <w:pStyle w:val="Caption"/>
         <w:keepNext/>
       </w:pPr>
-      <w:bookmarkStart w:id="54" w:name="_Toc243599046"/>
+      <w:bookmarkStart w:id="54" w:name="_Toc243599827"/>
       <w:r>
         <w:rPr>
           <w:b/>
@@ -23705,7 +23607,7 @@
       <w:pPr>
         <w:pStyle w:val="Caption"/>
       </w:pPr>
-      <w:bookmarkStart w:id="55" w:name="_Toc243599092"/>
+      <w:bookmarkStart w:id="55" w:name="_Toc243599873"/>
       <w:r>
         <w:rPr>
           <w:b/>
@@ -23750,7 +23652,7 @@
         <w:pStyle w:val="Caption"/>
         <w:keepNext/>
       </w:pPr>
-      <w:bookmarkStart w:id="56" w:name="_Toc243599047"/>
+      <w:bookmarkStart w:id="56" w:name="_Toc243599828"/>
       <w:r>
         <w:rPr>
           <w:b/>
@@ -24230,7 +24132,7 @@
           <w:numId w:val="0"/>
         </w:numPr>
       </w:pPr>
-      <w:bookmarkStart w:id="57" w:name="_Toc243599195"/>
+      <w:bookmarkStart w:id="57" w:name="_Toc243599901"/>
       <w:r>
         <w:rPr>
           <w:lang w:val="vi-VN"/>
@@ -24248,7 +24150,7 @@
           <w:numId w:val="0"/>
         </w:numPr>
       </w:pPr>
-      <w:bookmarkStart w:id="58" w:name="_Toc243599196"/>
+      <w:bookmarkStart w:id="58" w:name="_Toc243599902"/>
       <w:r>
         <w:rPr>
           <w:lang w:val="vi-VN"/>
@@ -24760,7 +24662,7 @@
           <w:numId w:val="0"/>
         </w:numPr>
       </w:pPr>
-      <w:bookmarkStart w:id="59" w:name="_Toc243599197"/>
+      <w:bookmarkStart w:id="59" w:name="_Toc243599903"/>
       <w:r>
         <w:rPr>
           <w:lang w:val="vi-VN"/>
@@ -24779,7 +24681,7 @@
           <w:numId w:val="0"/>
         </w:numPr>
       </w:pPr>
-      <w:bookmarkStart w:id="60" w:name="_Toc243599198"/>
+      <w:bookmarkStart w:id="60" w:name="_Toc243599904"/>
       <w:r>
         <w:rPr>
           <w:lang w:val="vi-VN"/>
@@ -24815,7 +24717,7 @@
         <w:pStyle w:val="Caption"/>
         <w:keepNext/>
       </w:pPr>
-      <w:bookmarkStart w:id="61" w:name="_Toc243599063"/>
+      <w:bookmarkStart w:id="61" w:name="_Toc243599844"/>
       <w:r>
         <w:rPr>
           <w:b/>
@@ -25383,7 +25285,7 @@
         <w:pStyle w:val="Caption"/>
         <w:keepNext/>
       </w:pPr>
-      <w:bookmarkStart w:id="62" w:name="_Toc243599064"/>
+      <w:bookmarkStart w:id="62" w:name="_Toc243599845"/>
       <w:r>
         <w:rPr>
           <w:b/>
@@ -26108,7 +26010,7 @@
         <w:pStyle w:val="Caption"/>
         <w:keepNext/>
       </w:pPr>
-      <w:bookmarkStart w:id="63" w:name="_Toc243599065"/>
+      <w:bookmarkStart w:id="63" w:name="_Toc243599846"/>
       <w:r>
         <w:rPr>
           <w:b/>
@@ -26574,7 +26476,7 @@
         <w:pStyle w:val="Caption"/>
         <w:keepNext/>
       </w:pPr>
-      <w:bookmarkStart w:id="64" w:name="_Toc243599066"/>
+      <w:bookmarkStart w:id="64" w:name="_Toc243599847"/>
       <w:r>
         <w:rPr>
           <w:b/>
@@ -27062,7 +26964,7 @@
         <w:pStyle w:val="Caption"/>
         <w:keepNext/>
       </w:pPr>
-      <w:bookmarkStart w:id="65" w:name="_Toc243599067"/>
+      <w:bookmarkStart w:id="65" w:name="_Toc243599848"/>
       <w:r>
         <w:rPr>
           <w:b/>
@@ -27667,7 +27569,7 @@
         <w:pStyle w:val="Caption"/>
         <w:keepNext/>
       </w:pPr>
-      <w:bookmarkStart w:id="66" w:name="_Toc243599068"/>
+      <w:bookmarkStart w:id="66" w:name="_Toc243599849"/>
       <w:r>
         <w:rPr>
           <w:b/>
@@ -28292,7 +28194,7 @@
         <w:pStyle w:val="Caption"/>
         <w:keepNext/>
       </w:pPr>
-      <w:bookmarkStart w:id="67" w:name="_Toc243599069"/>
+      <w:bookmarkStart w:id="67" w:name="_Toc243599850"/>
       <w:r>
         <w:rPr>
           <w:b/>
@@ -32511,7 +32413,7 @@
           <w:numId w:val="0"/>
         </w:numPr>
       </w:pPr>
-      <w:bookmarkStart w:id="68" w:name="_Toc243599199"/>
+      <w:bookmarkStart w:id="68" w:name="_Toc243599905"/>
       <w:r>
         <w:rPr>
           <w:lang w:val="vi-VN"/>
@@ -32595,7 +32497,7 @@
         <w:pStyle w:val="Caption"/>
         <w:keepNext/>
       </w:pPr>
-      <w:bookmarkStart w:id="69" w:name="_Toc243599070"/>
+      <w:bookmarkStart w:id="69" w:name="_Toc243599851"/>
       <w:r>
         <w:rPr>
           <w:b/>
@@ -47003,7 +46905,7 @@
           <w:numId w:val="0"/>
         </w:numPr>
       </w:pPr>
-      <w:bookmarkStart w:id="70" w:name="_Toc243599200"/>
+      <w:bookmarkStart w:id="70" w:name="_Toc243599906"/>
       <w:r>
         <w:rPr>
           <w:lang w:val="vi-VN"/>
@@ -47026,7 +46928,7 @@
         <w:pStyle w:val="Caption"/>
         <w:keepNext/>
       </w:pPr>
-      <w:bookmarkStart w:id="71" w:name="_Toc243599071"/>
+      <w:bookmarkStart w:id="71" w:name="_Toc243599852"/>
       <w:r>
         <w:rPr>
           <w:b/>
@@ -51871,7 +51773,7 @@
         <w:pStyle w:val="Caption"/>
         <w:keepNext/>
       </w:pPr>
-      <w:bookmarkStart w:id="72" w:name="_Toc243599072"/>
+      <w:bookmarkStart w:id="72" w:name="_Toc243599853"/>
       <w:r>
         <w:rPr>
           <w:b/>
@@ -59937,10 +59839,26 @@
 </file>
 
 <file path=customXml/item1.xml><?xml version="1.0" encoding="utf-8"?>
-<b:Sources xmlns:b="http://schemas.openxmlformats.org/officeDocument/2006/bibliography" xmlns="http://schemas.openxmlformats.org/officeDocument/2006/bibliography" SelectedStyle="\APASixthEditionOfficeOnline.xsl" StyleName="APA" Version="6"/>
+<p:properties xmlns:p="http://schemas.microsoft.com/office/2006/metadata/properties" xmlns:xsi="http://www.w3.org/2001/XMLSchema-instance" xmlns:pc="http://schemas.microsoft.com/office/infopath/2007/PartnerControls">
+  <documentManagement>
+    <TaxCatchAll xmlns="5d0b22ea-e5ea-49c7-9b62-902e21e51f08" xsi:nil="true"/>
+    <lcf76f155ced4ddcb4097134ff3c332f xmlns="f6f721e1-8a62-40be-993d-f44352021507">
+      <Terms xmlns="http://schemas.microsoft.com/office/infopath/2007/PartnerControls"/>
+    </lcf76f155ced4ddcb4097134ff3c332f>
+  </documentManagement>
+</p:properties>
 </file>
 
 <file path=customXml/item2.xml><?xml version="1.0" encoding="utf-8"?>
+<?mso-contentType ?>
+<FormTemplates xmlns="http://schemas.microsoft.com/sharepoint/v3/contenttype/forms">
+  <Display>DocumentLibraryForm</Display>
+  <Edit>DocumentLibraryForm</Edit>
+  <New>DocumentLibraryForm</New>
+</FormTemplates>
+</file>
+
+<file path=customXml/item3.xml><?xml version="1.0" encoding="utf-8"?>
 <ct:contentTypeSchema xmlns:ct="http://schemas.microsoft.com/office/2006/metadata/contentType" xmlns:ma="http://schemas.microsoft.com/office/2006/metadata/properties/metaAttributes" ct:_="" ma:_="" ma:contentTypeName="Tài liệu" ma:contentTypeID="0x0101009064D6C488808240A931504663625519" ma:contentTypeVersion="14" ma:contentTypeDescription="Tạo tài liệu mới." ma:contentTypeScope="" ma:versionID="917cc4c3b82354d7a8f69433fdf51fae">
   <xsd:schema xmlns:xsd="http://www.w3.org/2001/XMLSchema" xmlns:xs="http://www.w3.org/2001/XMLSchema" xmlns:p="http://schemas.microsoft.com/office/2006/metadata/properties" xmlns:ns2="f6f721e1-8a62-40be-993d-f44352021507" xmlns:ns3="5d0b22ea-e5ea-49c7-9b62-902e21e51f08" targetNamespace="http://schemas.microsoft.com/office/2006/metadata/properties" ma:root="true" ma:fieldsID="2f9312a3ec803083f43100d41fb65ef5" ns2:_="" ns3:_="">
     <xsd:import namespace="f6f721e1-8a62-40be-993d-f44352021507"/>
@@ -60169,35 +60087,30 @@
 </ct:contentTypeSchema>
 </file>
 
-<file path=customXml/item3.xml><?xml version="1.0" encoding="utf-8"?>
-<?mso-contentType ?>
-<FormTemplates xmlns="http://schemas.microsoft.com/sharepoint/v3/contenttype/forms">
-  <Display>DocumentLibraryForm</Display>
-  <Edit>DocumentLibraryForm</Edit>
-  <New>DocumentLibraryForm</New>
-</FormTemplates>
-</file>
-
 <file path=customXml/item4.xml><?xml version="1.0" encoding="utf-8"?>
-<p:properties xmlns:p="http://schemas.microsoft.com/office/2006/metadata/properties" xmlns:xsi="http://www.w3.org/2001/XMLSchema-instance" xmlns:pc="http://schemas.microsoft.com/office/infopath/2007/PartnerControls">
-  <documentManagement>
-    <TaxCatchAll xmlns="5d0b22ea-e5ea-49c7-9b62-902e21e51f08" xsi:nil="true"/>
-    <lcf76f155ced4ddcb4097134ff3c332f xmlns="f6f721e1-8a62-40be-993d-f44352021507">
-      <Terms xmlns="http://schemas.microsoft.com/office/infopath/2007/PartnerControls"/>
-    </lcf76f155ced4ddcb4097134ff3c332f>
-  </documentManagement>
-</p:properties>
+<b:Sources xmlns:b="http://schemas.openxmlformats.org/officeDocument/2006/bibliography" xmlns="http://schemas.openxmlformats.org/officeDocument/2006/bibliography" SelectedStyle="\APASixthEditionOfficeOnline.xsl" StyleName="APA" Version="6"/>
 </file>
 
 <file path=customXml/itemProps1.xml><?xml version="1.0" encoding="utf-8"?>
-<ds:datastoreItem xmlns:ds="http://schemas.openxmlformats.org/officeDocument/2006/customXml" ds:itemID="{06F34B39-710A-4AE8-9B09-0F6110FECC4E}">
+<ds:datastoreItem xmlns:ds="http://schemas.openxmlformats.org/officeDocument/2006/customXml" ds:itemID="{ACBFC553-1BE4-4450-B403-7F12C27FE3CA}">
   <ds:schemaRefs>
-    <ds:schemaRef ds:uri="http://schemas.openxmlformats.org/officeDocument/2006/bibliography"/>
+    <ds:schemaRef ds:uri="http://schemas.microsoft.com/office/2006/metadata/properties"/>
+    <ds:schemaRef ds:uri="http://schemas.microsoft.com/office/infopath/2007/PartnerControls"/>
+    <ds:schemaRef ds:uri="5d0b22ea-e5ea-49c7-9b62-902e21e51f08"/>
+    <ds:schemaRef ds:uri="f6f721e1-8a62-40be-993d-f44352021507"/>
   </ds:schemaRefs>
 </ds:datastoreItem>
 </file>
 
 <file path=customXml/itemProps2.xml><?xml version="1.0" encoding="utf-8"?>
+<ds:datastoreItem xmlns:ds="http://schemas.openxmlformats.org/officeDocument/2006/customXml" ds:itemID="{4ED417DC-AAC6-4AC2-9B84-BF5AEE7392F8}">
+  <ds:schemaRefs>
+    <ds:schemaRef ds:uri="http://schemas.microsoft.com/sharepoint/v3/contenttype/forms"/>
+  </ds:schemaRefs>
+</ds:datastoreItem>
+</file>
+
+<file path=customXml/itemProps3.xml><?xml version="1.0" encoding="utf-8"?>
 <ds:datastoreItem xmlns:ds="http://schemas.openxmlformats.org/officeDocument/2006/customXml" ds:itemID="{DA04E85B-2A7D-4814-AE68-20A674C21DD2}">
   <ds:schemaRefs>
     <ds:schemaRef ds:uri="http://schemas.microsoft.com/office/2006/metadata/contentType"/>
@@ -60216,21 +60129,10 @@
 </ds:datastoreItem>
 </file>
 
-<file path=customXml/itemProps3.xml><?xml version="1.0" encoding="utf-8"?>
-<ds:datastoreItem xmlns:ds="http://schemas.openxmlformats.org/officeDocument/2006/customXml" ds:itemID="{4ED417DC-AAC6-4AC2-9B84-BF5AEE7392F8}">
+<file path=customXml/itemProps4.xml><?xml version="1.0" encoding="utf-8"?>
+<ds:datastoreItem xmlns:ds="http://schemas.openxmlformats.org/officeDocument/2006/customXml" ds:itemID="{06F34B39-710A-4AE8-9B09-0F6110FECC4E}">
   <ds:schemaRefs>
-    <ds:schemaRef ds:uri="http://schemas.microsoft.com/sharepoint/v3/contenttype/forms"/>
-  </ds:schemaRefs>
-</ds:datastoreItem>
-</file>
-
-<file path=customXml/itemProps4.xml><?xml version="1.0" encoding="utf-8"?>
-<ds:datastoreItem xmlns:ds="http://schemas.openxmlformats.org/officeDocument/2006/customXml" ds:itemID="{ACBFC553-1BE4-4450-B403-7F12C27FE3CA}">
-  <ds:schemaRefs>
-    <ds:schemaRef ds:uri="http://schemas.microsoft.com/office/2006/metadata/properties"/>
-    <ds:schemaRef ds:uri="http://schemas.microsoft.com/office/infopath/2007/PartnerControls"/>
-    <ds:schemaRef ds:uri="5d0b22ea-e5ea-49c7-9b62-902e21e51f08"/>
-    <ds:schemaRef ds:uri="f6f721e1-8a62-40be-993d-f44352021507"/>
+    <ds:schemaRef ds:uri="http://schemas.openxmlformats.org/officeDocument/2006/bibliography"/>
   </ds:schemaRefs>
 </ds:datastoreItem>
 </file>
</xml_diff>